<commit_message>
Document execution-intelligence positioning and future inference correlation.
Keep Week 1–3 and locked ADRs unchanged; treat inference servers as external systems, not a current implementation phase.

Co-authored-by: Cursor <cursoragent@cursor.com>
</commit_message>
<xml_diff>
--- a/docs/Agent_Execution_Intelligence_Architecture_and_Execution_Plan_v0.2_Concrete.docx
+++ b/docs/Agent_Execution_Intelligence_Architecture_and_Execution_Plan_v0.2_Concrete.docx
@@ -21,7 +21,7 @@
         <w:rPr>
           <w:i/>
         </w:rPr>
-        <w:t>Open-source, local-first developer platform for observing, understanding, controlling, replaying, and learning from AI-agent execution</w:t>
+        <w:t>Open-source, local-first execution intelligence layer for observing and understanding AI-agent execution, with architecture designed for later coordination, replay, and inference-system correlation</w:t>
       </w:r>
     </w:p>
     <w:p>
@@ -42,7 +42,7 @@
     </w:p>
     <w:p>
       <w:r>
-        <w:t>This document defines the target architecture and phased implementation plan for an open-source Agent Execution Intelligence platform. The platform sits beside existing AI-agent applications rather than replacing their orchestration framework. Developers connect an existing agent, run it normally, and receive a local web UI showing the real execution graph, timeline, node details, observable decision metadata, runtime controls, replay/fork capabilities, and—over time—an experience graph that turns historical runs into reusable execution knowledge.</w:t>
+        <w:t>Tselora is an execution intelligence layer for AI agents. It captures and correlates agent execution events today, with an architecture designed to eventually correlate agent execution with inference-system telemetry and, later, enable execution-aware coordination and optimization. This document defines the target architecture and phased implementation plan. The platform sits beside existing AI-agent applications rather than replacing their orchestration framework. Developers connect an existing agent, run it normally, and receive a local web UI showing the real execution graph, timeline, node details, and observable decision metadata. Runtime controls, replay/fork capabilities, and—over time—an experience graph remain later layers; they are not present capabilities of the current implementation.</w:t>
       </w:r>
     </w:p>
     <w:p>
@@ -51,6 +51,40 @@
       </w:r>
     </w:p>
     <w:p>
+      <w:pPr/>
+      <w:r>
+        <w:t>The current system is fundamentally an agent execution observability foundation:</w:t>
+      </w:r>
+    </w:p>
+    <w:p>
+      <w:pPr>
+        <w:pStyle w:val="NoSpacing"/>
+      </w:pPr>
+      <w:r>
+        <w:t>Agent</w:t>
+        <w:br/>
+        <w:t xml:space="preserve">  │</w:t>
+        <w:br/>
+        <w:t xml:space="preserve">  ├── Node / Function</w:t>
+        <w:br/>
+        <w:t xml:space="preserve">  │      └── Nested Node / Function</w:t>
+        <w:br/>
+        <w:t xml:space="preserve">  │</w:t>
+        <w:br/>
+        <w:t xml:space="preserve">  ├── Tool</w:t>
+        <w:br/>
+        <w:t xml:space="preserve">  │</w:t>
+        <w:br/>
+        <w:t xml:space="preserve">  └── LLM invocation</w:t>
+      </w:r>
+    </w:p>
+    <w:p>
+      <w:pPr/>
+      <w:r>
+        <w:t>Tselora captures and correlates that execution using run identity, event identity, producer-side sequence, causal parent_event_id, stable logical node.id, execution_instance_id, execution lifecycle events, and reliable delivery (batching, retry, and backpressure). That agent-execution observability path remains the immediate implementation focus.</w:t>
+      </w:r>
+    </w:p>
+    <w:p>
       <w:pPr>
         <w:pStyle w:val="Heading1"/>
       </w:pPr>
@@ -60,7 +94,33 @@
     </w:p>
     <w:p>
       <w:r>
-        <w:t>Positioning: “DevTools for AI agents.” The long-term product is an execution intelligence and control layer, not another agent framework.</w:t>
+        <w:t>Positioning: Tselora is an execution intelligence layer for AI agents. It is not merely an agent observability product, not another agent framework, and not an inference engine. The current implementation captures and correlates agent execution events. It is not an “Agent Control Plane.” If a control plane emerges, it is a potential future evolution after observability and intelligence, not a name for the system today.</w:t>
+      </w:r>
+    </w:p>
+    <w:p>
+      <w:pPr/>
+      <w:r>
+        <w:t>Capability evolution (later layers do not change the current roadmap):</w:t>
+      </w:r>
+    </w:p>
+    <w:p>
+      <w:pPr>
+        <w:pStyle w:val="NoSpacing"/>
+      </w:pPr>
+      <w:r>
+        <w:t>Execution Observability</w:t>
+        <w:br/>
+        <w:t xml:space="preserve">        ↓</w:t>
+        <w:br/>
+        <w:t>Execution Intelligence</w:t>
+        <w:br/>
+        <w:t xml:space="preserve">        ↓</w:t>
+        <w:br/>
+        <w:t>Execution Coordination</w:t>
+        <w:br/>
+        <w:t xml:space="preserve">        ↓</w:t>
+        <w:br/>
+        <w:t>Execution Optimization / Control</w:t>
       </w:r>
     </w:p>
     <w:tbl>
@@ -433,6 +493,30 @@
       </w:pPr>
       <w:r>
         <w:t>Building a distributed production control plane before the local developer workflow is proven.</w:t>
+      </w:r>
+    </w:p>
+    <w:p>
+      <w:pPr>
+        <w:pStyle w:val="ListBullet"/>
+      </w:pPr>
+      <w:r>
+        <w:t>Being an inference engine or implementing inference-server internals (including vLLM-specific architecture in the core).</w:t>
+      </w:r>
+    </w:p>
+    <w:p>
+      <w:pPr>
+        <w:pStyle w:val="ListBullet"/>
+      </w:pPr>
+      <w:r>
+        <w:t>Inference optimization as part of the current implementation roadmap or MVP.</w:t>
+      </w:r>
+    </w:p>
+    <w:p>
+      <w:pPr>
+        <w:pStyle w:val="ListBullet"/>
+      </w:pPr>
+      <w:r>
+        <w:t>Describing the current system as an Agent Control Plane or treating runtime control as already shipped.</w:t>
       </w:r>
     </w:p>
     <w:p>
@@ -1235,6 +1319,12 @@
         <w:t>The event protocol is the most important reusable asset. Every adapter should emit the same semantic event types even when source frameworks differ.</w:t>
       </w:r>
     </w:p>
+    <w:p>
+      <w:pPr/>
+      <w:r>
+        <w:t>The existing event model should remain extensible enough to represent or correlate future inference-system telemetry without redesigning fundamental execution semantics (run_id, event_id, sequence, parent_event_id, node.id, execution_instance_id). This document does not invent inference-specific event schemas now. Any later correlation must stay inference-system-neutral: an inference server answers how to execute model inference efficiently; Tselora’s future role is to understand how inference behavior relates to overall agent execution and, eventually, enable execution-aware coordination and optimization.</w:t>
+      </w:r>
+    </w:p>
     <w:tbl>
       <w:tblPr>
         <w:tblStyle w:val="TableGrid"/>
@@ -3919,6 +4009,12 @@
       </w:r>
     </w:p>
     <w:p>
+      <w:pPr/>
+      <w:r>
+        <w:t>Immediate path (unchanged): Agent process → SDK creates event → event_id + sequence + parent_event_id assigned → async queue → batch transport → local collector → validate + dedupe + append JSONL → ProjectionEngine (Week 3) → state patch → WebSocket → React UI. The SDK never writes the event file; the collector owns persistence. JSONL remains authoritative for v1. Future inference-system telemetry, if correlated, must attach to this same execution identity model rather than become a second source of truth.</w:t>
+      </w:r>
+    </w:p>
+    <w:p>
       <w:pPr>
         <w:pStyle w:val="Heading2"/>
       </w:pPr>
@@ -3972,6 +4068,30 @@
       </w:pPr>
       <w:r>
         <w:t>The UI is a first-class product surface, but it is never the source of truth.</w:t>
+      </w:r>
+    </w:p>
+    <w:p>
+      <w:pPr>
+        <w:pStyle w:val="ListBullet"/>
+      </w:pPr>
+      <w:r>
+        <w:t>Tselora is not an inference engine. Inference servers such as vLLM are external systems whose telemetry may eventually be correlated with Tselora execution events.</w:t>
+      </w:r>
+    </w:p>
+    <w:p>
+      <w:pPr>
+        <w:pStyle w:val="ListBullet"/>
+      </w:pPr>
+      <w:r>
+        <w:t>The core architecture remains inference-system-neutral. No vLLM-specific or other inference-runtime assumptions belong in core.</w:t>
+      </w:r>
+    </w:p>
+    <w:p>
+      <w:pPr>
+        <w:pStyle w:val="ListBullet"/>
+      </w:pPr>
+      <w:r>
+        <w:t>Inference optimization is not part of Week 1–3 or the current MVP.</w:t>
       </w:r>
     </w:p>
     <w:p>
@@ -5636,6 +5756,116 @@
       </w:pPr>
       <w:r>
         <w:t>Phase 10 — Optional SQL/server scale path.</w:t>
+      </w:r>
+    </w:p>
+    <w:p>
+      <w:pPr>
+        <w:pStyle w:val="Heading2"/>
+      </w:pPr>
+      <w:r>
+        <w:t>18.8 Future Extension — Agent Execution and Inference Intelligence</w:t>
+      </w:r>
+    </w:p>
+    <w:p>
+      <w:pPr/>
+      <w:r>
+        <w:t>This subsection is architectural direction only. It does not add a Week 1–3 work item, change locked ADRs, or authorize inference integrations in the current implementation sequence.</w:t>
+      </w:r>
+    </w:p>
+    <w:p>
+      <w:pPr/>
+      <w:r>
+        <w:t>Tselora’s architecture is intended to eventually correlate agent execution telemetry with inference-system telemetry:</w:t>
+      </w:r>
+    </w:p>
+    <w:p>
+      <w:pPr>
+        <w:pStyle w:val="NoSpacing"/>
+      </w:pPr>
+      <w:r>
+        <w:t xml:space="preserve">                    TSELORA</w:t>
+        <w:br/>
+        <w:t xml:space="preserve">              Execution Intelligence</w:t>
+        <w:br/>
+        <w:t xml:space="preserve">                       │</w:t>
+        <w:br/>
+        <w:t xml:space="preserve">             ┌─────────┴─────────┐</w:t>
+        <w:br/>
+        <w:t xml:space="preserve">             │                   │</w:t>
+        <w:br/>
+        <w:t xml:space="preserve">      Agent Execution        Inference</w:t>
+        <w:br/>
+        <w:t xml:space="preserve">      Observability          Observability</w:t>
+        <w:br/>
+        <w:t xml:space="preserve">             │                   │</w:t>
+        <w:br/>
+        <w:t xml:space="preserve">      nodes / tools          LLM requests</w:t>
+        <w:br/>
+        <w:t xml:space="preserve">      workflows              tokens</w:t>
+        <w:br/>
+        <w:t xml:space="preserve">      dependencies           latency</w:t>
+        <w:br/>
+        <w:t xml:space="preserve">      retries                KV-cache behavior</w:t>
+        <w:br/>
+        <w:t xml:space="preserve">      failures               GPU/runtime metrics</w:t>
+        <w:br/>
+        <w:t xml:space="preserve">             │                   │</w:t>
+        <w:br/>
+        <w:t xml:space="preserve">             └─────────┬─────────┘</w:t>
+        <w:br/>
+        <w:t xml:space="preserve">                       │</w:t>
+        <w:br/>
+        <w:t xml:space="preserve">                       ▼</w:t>
+        <w:br/>
+        <w:t xml:space="preserve">              Execution Intelligence</w:t>
+      </w:r>
+    </w:p>
+    <w:p>
+      <w:pPr/>
+      <w:r>
+        <w:t>A future correlated execution may conceptually look like:</w:t>
+      </w:r>
+    </w:p>
+    <w:p>
+      <w:pPr>
+        <w:pStyle w:val="NoSpacing"/>
+      </w:pPr>
+      <w:r>
+        <w:t>Agent Run</w:t>
+        <w:br/>
+        <w:t xml:space="preserve">   │</w:t>
+        <w:br/>
+        <w:t xml:space="preserve">   └── Node</w:t>
+        <w:br/>
+        <w:t xml:space="preserve">        │</w:t>
+        <w:br/>
+        <w:t xml:space="preserve">        └── LLM invocation</w:t>
+        <w:br/>
+        <w:t xml:space="preserve">               │</w:t>
+        <w:br/>
+        <w:t xml:space="preserve">               └── Inference request</w:t>
+        <w:br/>
+        <w:t xml:space="preserve">                      ├── latency</w:t>
+        <w:br/>
+        <w:t xml:space="preserve">                      ├── tokens</w:t>
+        <w:br/>
+        <w:t xml:space="preserve">                      ├── queueing</w:t>
+        <w:br/>
+        <w:t xml:space="preserve">                      ├── cache behavior</w:t>
+        <w:br/>
+        <w:t xml:space="preserve">                      └── GPU/runtime telemetry</w:t>
+      </w:r>
+    </w:p>
+    <w:p>
+      <w:pPr/>
+      <w:r>
+        <w:t>The purpose is to eventually allow questions that cross the agent/inference boundary, such as: Why was an agent execution slow? How much of the execution latency came from inference? Which agent/node executions generated particular inference workloads? How did inference behavior affect an agent run? How might execution-level information eventually inform coordination or optimization?</w:t>
+      </w:r>
+    </w:p>
+    <w:p>
+      <w:pPr/>
+      <w:r>
+        <w:t>An inference server answers how to execute model inference efficiently. Tselora’s future role is to understand how inference behavior relates to the overall agent execution and, eventually, enable execution-aware coordination and optimization. Correlation, if added, must reuse existing execution identity (run_id, event_id, parent_event_id, node.id, execution_instance_id) rather than invent a parallel execution model.</w:t>
       </w:r>
     </w:p>
     <w:p>
@@ -6727,6 +6957,30 @@
     </w:p>
     <w:p>
       <w:pPr>
+        <w:pStyle w:val="ListNumber"/>
+      </w:pPr>
+      <w:r>
+        <w:t>Tselora is an execution intelligence layer, not an inference engine and not a current Agent Control Plane.</w:t>
+      </w:r>
+    </w:p>
+    <w:p>
+      <w:pPr>
+        <w:pStyle w:val="ListNumber"/>
+      </w:pPr>
+      <w:r>
+        <w:t>The Universal Agent Event Protocol should remain extensible enough to correlate future inference-system telemetry without redesigning execution semantics.</w:t>
+      </w:r>
+    </w:p>
+    <w:p>
+      <w:pPr>
+        <w:pStyle w:val="ListNumber"/>
+      </w:pPr>
+      <w:r>
+        <w:t>Inference servers remain external and inference-system-neutral relative to core; no inference optimization work is in the current MVP.</w:t>
+      </w:r>
+    </w:p>
+    <w:p>
+      <w:pPr>
         <w:pStyle w:val="Heading1"/>
       </w:pPr>
       <w:r>
@@ -6891,6 +7145,14 @@
       </w:pPr>
       <w:r>
         <w:t>Plugin architecture for custom evaluators, policy engines and visualization panels.</w:t>
+      </w:r>
+    </w:p>
+    <w:p>
+      <w:pPr>
+        <w:pStyle w:val="ListBullet"/>
+      </w:pPr>
+      <w:r>
+        <w:t>Eventually correlate agent execution events with inference-system telemetry (latency, tokens, queueing, cache behavior, GPU/runtime metrics) in an inference-system-neutral way. This is not a current-phase deliverable and must not pull vLLM or other inference-runtime implementation into core.</w:t>
       </w:r>
     </w:p>
     <w:p>
@@ -6907,8 +7169,14 @@
       </w:r>
     </w:p>
     <w:p>
+      <w:pPr/>
       <w:r>
-        <w:t>The product thesis is simple: developers should not have to rebuild their agents inside a new framework just to understand what the agent is doing. The platform should attach to the agent they already have and make its execution understandable and controllable.</w:t>
+        <w:t>Do not expand the first public milestone to include inference-server integration, inference optimization, or a control plane. Those may follow only after the local execution-observability workflow is proven.</w:t>
+      </w:r>
+    </w:p>
+    <w:p>
+      <w:r>
+        <w:t>The product thesis is simple: developers should not have to rebuild their agents inside a new framework just to understand what the agent is doing. The platform should attach to the agent they already have and make its execution understandable—and, later, coordinable—without becoming the inference engine or claiming control capabilities it does not yet have.</w:t>
       </w:r>
     </w:p>
     <w:p>

</xml_diff>

<commit_message>
Sync architecture and v1 documentation
Co-authored-by: Cursor <cursoragent@cursor.com>
</commit_message>
<xml_diff>
--- a/docs/Agent_Execution_Intelligence_Architecture_and_Execution_Plan_v0.2_Concrete.docx
+++ b/docs/Agent_Execution_Intelligence_Architecture_and_Execution_Plan_v0.2_Concrete.docx
@@ -38,6 +38,12 @@
       </w:pPr>
       <w:r>
         <w:t>1. Executive Summary</w:t>
+      </w:r>
+    </w:p>
+    <w:p>
+      <w:pPr/>
+      <w:r>
+        <w:t>Document sync rule: when documentation conflicts, (1) locked ADRs in docs/adr/ win for implementation, (2) docs/product/v1.md wins for v1 scope, (3) this long-form plan must be synchronized rather than left contradictory.</w:t>
       </w:r>
     </w:p>
     <w:p>
@@ -94,7 +100,7 @@
     </w:p>
     <w:p>
       <w:r>
-        <w:t>Positioning: Tselora is an execution intelligence layer for AI agents. It is not merely an agent observability product, not another agent framework, and not an inference engine. The current implementation captures and correlates agent execution events. It is not an “Agent Control Plane.” If a control plane emerges, it is a potential future evolution after observability and intelligence, not a name for the system today.</w:t>
+        <w:t>Positioning: Tselora is an execution intelligence layer for AI agents. It is not merely an agent observability product, not another agent framework, and not an inference engine. The current implementation captures and correlates agent execution events. It is not an “Agent Control Plane.” If a control plane emerges, it is a potential future evolution after observability and intelligence, not a name for the system today. Tselora provides an execution shadow (structure, causality, node identity, instances, timeline, retries, loops, fan-out, observable decisions). It is not an inference engine, vLLM replacement, agent harness, generic LLM dashboard, or evaluation product. It may coexist with OTEL and LLM observability systems via adapters.</w:t>
       </w:r>
     </w:p>
     <w:p>
@@ -712,7 +718,7 @@
         <w:pStyle w:val="ListNumber"/>
       </w:pPr>
       <w:r>
-        <w:t>Install: `pip install agent-devtools`.</w:t>
+        <w:t>Install: `pip install tselora` (or `pip install -e ".[dev]"` from this repository).</w:t>
       </w:r>
     </w:p>
     <w:p>
@@ -720,7 +726,7 @@
         <w:pStyle w:val="ListNumber"/>
       </w:pPr>
       <w:r>
-        <w:t>Launch: `agent-devtools run app.py`.</w:t>
+        <w:t>Launch the local collector (CLI `run` is not implemented yet) and an instrumented Python agent.</w:t>
       </w:r>
     </w:p>
     <w:p>
@@ -760,7 +766,7 @@
         <w:pStyle w:val="ListNumber"/>
       </w:pPr>
       <w:r>
-        <w:t>Developer can pause or stop a live run; later releases add approve/retry/fork.</w:t>
+        <w:t>v1: inspect graph, timeline, node details, and visualization replay. Pause/stop/approve/retry/fork are later, not the v1 golden path.</w:t>
       </w:r>
     </w:p>
     <w:p>
@@ -768,7 +774,7 @@
         <w:pStyle w:val="ListNumber"/>
       </w:pPr>
       <w:r>
-        <w:t>Failed runs can be replayed from a checkpoint and forked into alternative executions.</w:t>
+        <w:t>v1 visualization replay reconstructs recorded state from JSONL. Real checkpoint fork/re-execution is later and contract-driven.</w:t>
       </w:r>
     </w:p>
     <w:p>
@@ -776,7 +782,7 @@
         <w:pStyle w:val="ListNumber"/>
       </w:pPr>
       <w:r>
-        <w:t>Completed runs are retained as experience records for cross-run analysis.</w:t>
+        <w:t>Completed runs are retained as local JSONL logs. Cross-run experience records are later / experimental.</w:t>
       </w:r>
     </w:p>
     <w:p>
@@ -1108,7 +1114,7 @@
           </w:tcPr>
           <w:p>
             <w:r>
-              <w:t>SQLite</w:t>
+              <w:t>JSONL (JsonlEventStore)</w:t>
             </w:r>
           </w:p>
         </w:tc>
@@ -1130,7 +1136,7 @@
           </w:tcPr>
           <w:p>
             <w:r>
-              <w:t>Run, graph, node, event and control endpoints</w:t>
+              <w:t>Run, graph, node, event endpoints; control endpoints later</w:t>
             </w:r>
           </w:p>
         </w:tc>
@@ -1226,7 +1232,7 @@
           </w:tcPr>
           <w:p>
             <w:r>
-              <w:t>Graph, timeline, inspector, controls, history</w:t>
+              <w:t>Graph, timeline, inspector, history; controls later</w:t>
             </w:r>
           </w:p>
         </w:tc>
@@ -1300,7 +1306,7 @@
           </w:tcPr>
           <w:p>
             <w:r>
-              <w:t>JSONL files initially; SQL later</w:t>
+              <w:t>Later (not v1)</w:t>
             </w:r>
           </w:p>
         </w:tc>
@@ -1705,7 +1711,7 @@
           </w:tcPr>
           <w:p>
             <w:r>
-              <w:t>Recommended</w:t>
+              <w:t>Yes (emitted events)</w:t>
             </w:r>
           </w:p>
         </w:tc>
@@ -1715,7 +1721,7 @@
           </w:tcPr>
           <w:p>
             <w:r>
-              <w:t>Monotonic ordering within a run</w:t>
+              <w:t>Producer-assigned monotonic order within a run</w:t>
             </w:r>
           </w:p>
         </w:tc>
@@ -2339,7 +2345,7 @@
     </w:tbl>
     <w:p>
       <w:r>
-        <w:t>Initial SQLite schema should index run_id, timestamp, event type, node id, parent event, and sequence. Use JSON columns for extensible payloads while keeping high-value query fields normalized.</w:t>
+        <w:t>v1 persistence is append-only JSONL via JsonlEventStore. The event log is authoritative; ProjectionEngine derives run/graph/UI state. SQLite/PostgreSQL may be added later behind EventStore for indexing (run_id, timestamp, event type, node id, parent event, sequence) without changing the protocol.</w:t>
       </w:r>
     </w:p>
     <w:p>
@@ -3478,7 +3484,7 @@
           </w:tcPr>
           <w:p>
             <w:r>
-              <w:t>MVP/2</w:t>
+              <w:t>After v1 raw-Python slice</w:t>
             </w:r>
           </w:p>
         </w:tc>
@@ -3488,7 +3494,7 @@
           </w:tcPr>
           <w:p>
             <w:r>
-              <w:t>Map spans/events into protocol</w:t>
+              <w:t>Lossy inbound adapter: OTEL → Tselora events. Missing parent is better than a fabricated causal edge. Not gen_ai.* as core fields.</w:t>
             </w:r>
           </w:p>
         </w:tc>
@@ -3793,7 +3799,7 @@
           </w:tcPr>
           <w:p>
             <w:r>
-              <w:t>Single process/CLI + SQLite + localhost UI</w:t>
+              <w:t>Single process/CLI + JSONL EventStore + localhost UI</w:t>
             </w:r>
           </w:p>
         </w:tc>
@@ -3815,7 +3821,7 @@
           </w:tcPr>
           <w:p>
             <w:r>
-              <w:t>Agent process + collector + UI; SQLite/Postgres</w:t>
+              <w:t>Agent process + collector + UI; JSONL (SQL later behind EventStore)</w:t>
             </w:r>
           </w:p>
         </w:tc>
@@ -3880,7 +3886,7 @@
     </w:p>
     <w:p>
       <w:r>
-        <w:t>These decisions are the implementation contract for v0.2. They replace earlier ambiguous choices and should be treated as authoritative until an explicit architecture review changes them.</w:t>
+        <w:t>Authority: docs/adr/ contains the normative ADRs. This section summarizes them and must not contradict those files. If they diverge, docs/adr/ wins for implementation and docs/product/v1.md wins for v1 scope; this long-form plan must be synchronized.</w:t>
       </w:r>
     </w:p>
     <w:p>
@@ -3888,12 +3894,12 @@
         <w:pStyle w:val="Heading2"/>
       </w:pPr>
       <w:r>
-        <w:t>ADR-001 — Transport, Ordering, and Delivery</w:t>
+        <w:t>ADR-001 — Event protocol</w:t>
       </w:r>
     </w:p>
     <w:p>
       <w:r>
-        <w:t>The SDK emits events locally, assigns a globally unique event_id and a monotonic per-run sequence at emission time, queues events asynchronously, and flushes them in batches over a persistent/keep-alive connection to the local collector. Delivery is at-least-once. The collector deduplicates by event_id, accepts out-of-order arrivals, and may briefly buffer events by (run_id, sequence) when materializing state. Collector receive order is never treated as causal order.</w:t>
+        <w:t>Universal Agent Event Protocol is the only contract between instrumentation and Tselora. Emitted events include schema_version, event_id, run_id, sequence (required, producer-assigned, monotonic per run), timestamp, and type. Optional fields include parent_event_id, actor, node, execution_instance_id, status, payload, and metadata. Framework objects stay out of core. OpenTelemetry is a bridge/adapter, not the core model.</w:t>
       </w:r>
     </w:p>
     <w:p>
@@ -3901,12 +3907,12 @@
         <w:pStyle w:val="Heading2"/>
       </w:pPr>
       <w:r>
-        <w:t>ADR-002 — Node Identity and Graph Semantics</w:t>
+        <w:t>ADR-002 — Event ordering</w:t>
       </w:r>
     </w:p>
     <w:p>
       <w:r>
-        <w:t>A logical node receives an explicit user label when supplied; otherwise raw Python uses a qualified function name. node_id remains stable across loop iterations. execution_instance_id identifies one invocation, allowing concurrent fan-out to collapse into one visual node while preserving instance history. Edges are derived from parent_event_id, not temporal adjacency. Loop detection is projection/collector-side; adapters may emit loop.detected when they already know a loop boundary.</w:t>
+        <w:t>SDK assigns event_id and monotonic sequence at emit time. Transport is asynchronous and at-least-once. Deduplicate on event_id. Order projection by sequence within run_id. Causality uses parent_event_id, never arrival order or temporal adjacency. Retries reuse the same event_id and sequence.</w:t>
       </w:r>
     </w:p>
     <w:p>
@@ -3914,12 +3920,12 @@
         <w:pStyle w:val="Heading2"/>
       </w:pPr>
       <w:r>
-        <w:t>ADR-003 — Concurrency and Causal Context</w:t>
+        <w:t>ADR-003 — Node identity</w:t>
       </w:r>
     </w:p>
     <w:p>
       <w:r>
-        <w:t>The SDK uses a contextvars-based active-node stack. Node entry/exit updates this context and event creation reads it to establish parent_event_id. Explicit propagation helpers are provided for executor/thread boundaries. Opaque third-party concurrency, subprocesses, and libraries that create independent execution contexts are documented limitations rather than silently inferred relationships.</w:t>
+        <w:t>Separate stable logical node.id from execution_instance_id (one invocation). Loops reuse logical ids. Edges come from parent_event_id. Do not derive causal edges from timestamps. Concurrency helpers (bind_context / propagate_context) live in architecture/concurrency.md and sdk/context.py; they are not a separate numbered ADR.</w:t>
       </w:r>
     </w:p>
     <w:p>
@@ -3927,12 +3933,12 @@
         <w:pStyle w:val="Heading2"/>
       </w:pPr>
       <w:r>
-        <w:t>ADR-004 — Canonical Projection and WebSocket Model</w:t>
+        <w:t>ADR-004 — Projection engine</w:t>
       </w:r>
     </w:p>
     <w:p>
       <w:r>
-        <w:t>The immutable event log is the sole source of truth. A single ProjectionEngine materializes graph, timeline, run state, and node state. Active runs keep an in-memory projection; snapshots are an optimization. WebSocket messages contain state patches. REST provides the full current state for initial load and reconnect. The React client does not reimplement graph semantics. The same projection code is used for live execution and visualization replay.</w:t>
+        <w:t>The immutable event log is the sole source of truth. A single ProjectionEngine implements apply(event) and rebuild(events) and derives RunState, NodeState, GraphState, and TimelineState. The same logic supports live execution, REST, WebSocket, and visualization replay. Snapshots are optimization only. The React app must not reconstruct execution semantics independently.</w:t>
       </w:r>
     </w:p>
     <w:p>
@@ -3940,12 +3946,12 @@
         <w:pStyle w:val="Heading2"/>
       </w:pPr>
       <w:r>
-        <w:t>ADR-005 — Replay and Checkpoint Semantics</w:t>
+        <w:t>ADR-005 — WebSocket patches</w:t>
       </w:r>
     </w:p>
     <w:p>
       <w:r>
-        <w:t>Replay v1 means visualization replay: reconstruct recorded state from the event stream and scrub through it. checkpoint.created is defined in the protocol now, with an optional serialized-state reference. Real re-execution/fork is later and requires an explicit user-agent checkpoint/resume contract. Arbitrary Python process state is not assumed to be serializable or restartable.</w:t>
+        <w:t>REST bootstraps full projected state (load, reconnect, history). WebSocket carries state patches produced after ProjectionEngine apply. The UI does not independently reconstruct execution semantics. Visualization replay is re-projection of the log; real fork/re-execution remains later and contract-driven (checkpoint.created is reserved).</w:t>
       </w:r>
     </w:p>
     <w:p>
@@ -3953,12 +3959,12 @@
         <w:pStyle w:val="Heading2"/>
       </w:pPr>
       <w:r>
-        <w:t>ADR-006 — File-Based Persistence</w:t>
+        <w:t>ADR-006 — File-based persistence</w:t>
       </w:r>
     </w:p>
     <w:p>
       <w:r>
-        <w:t>v1 does not require a database. The collector writes an append-only JSONL event stream to the local filesystem. Each run has its own event file plus optional metadata and snapshot files. A storage-neutral EventStore interface isolates the rest of the system from the file format. SQLite/PostgreSQL can be added later for indexing, querying, multi-user operation, and higher-volume workloads without changing the Universal Agent Event Protocol.</w:t>
+        <w:t>v1 does not require a database. JsonlEventStore writes an append-only JSONL event stream (currently under .agent-devtools/runs/&lt;run_id&gt;/, the implemented data directory). JSONL is authoritative. EventStore isolates later SQLite/PostgreSQL. No SQLite, Postgres, Redis, or Kafka in v1.</w:t>
       </w:r>
     </w:p>
     <w:p>
@@ -5882,7 +5888,7 @@
           <w:rFonts w:ascii="Consolas" w:hAnsi="Consolas"/>
           <w:sz w:val="17"/>
         </w:rPr>
-        <w:t>agent-devtools/</w:t>
+        <w:t>tselora/</w:t>
         <w:br/>
         <w:t>├── core/</w:t>
         <w:br/>
@@ -6157,7 +6163,7 @@
           </w:tcPr>
           <w:p>
             <w:r>
-              <w:t>5. Control</w:t>
+              <w:t>5. Control (later / not v1)</w:t>
             </w:r>
           </w:p>
         </w:tc>
@@ -6199,7 +6205,7 @@
           </w:tcPr>
           <w:p>
             <w:r>
-              <w:t>Checkpoints + replay engine</w:t>
+              <w:t>Visualization replay from the event log (v1); real re-execution later</w:t>
             </w:r>
           </w:p>
         </w:tc>
@@ -6221,7 +6227,7 @@
           </w:tcPr>
           <w:p>
             <w:r>
-              <w:t>7. Fork</w:t>
+              <w:t>7. Fork (later / not v1)</w:t>
             </w:r>
           </w:p>
         </w:tc>
@@ -6263,7 +6269,7 @@
           </w:tcPr>
           <w:p>
             <w:r>
-              <w:t>OTel + one major framework</w:t>
+              <w:t>OTel (lossy inbound) + one major framework, after raw-Python v1</w:t>
             </w:r>
           </w:p>
         </w:tc>
@@ -6285,7 +6291,7 @@
           </w:tcPr>
           <w:p>
             <w:r>
-              <w:t>9. Experience</w:t>
+              <w:t>9. Experience (later / not v1)</w:t>
             </w:r>
           </w:p>
         </w:tc>
@@ -6317,7 +6323,7 @@
           </w:tcPr>
           <w:p>
             <w:r>
-              <w:t>10. Intelligence</w:t>
+              <w:t>10. Intelligence (later)</w:t>
             </w:r>
           </w:p>
         </w:tc>
@@ -6404,7 +6410,7 @@
         <w:pStyle w:val="ListNumber"/>
       </w:pPr>
       <w:r>
-        <w:t>Week 7: Add pause/resume/stop command channel and runtime state machine.</w:t>
+        <w:t>Later (not v1 / not the first public milestone): pause/resume/stop command channel and runtime state machine.</w:t>
       </w:r>
     </w:p>
     <w:p>
@@ -6412,7 +6418,7 @@
         <w:pStyle w:val="ListNumber"/>
       </w:pPr>
       <w:r>
-        <w:t>Week 8: Package the one-command developer experience, documentation, examples and end-to-end tests.</w:t>
+        <w:t>Package the one-command developer experience after the Week 3 inspect/replay slice is proven; do not wait on the control channel.</w:t>
       </w:r>
     </w:p>
     <w:p>
@@ -6920,7 +6926,7 @@
         <w:pStyle w:val="ListNumber"/>
       </w:pPr>
       <w:r>
-        <w:t>SQLite is the initial persistence layer; PostgreSQL is the migration target.</w:t>
+        <w:t>JSONL (JsonlEventStore) is the v1 persistence layer; SQLite/PostgreSQL are later EventStore implementations.</w:t>
       </w:r>
     </w:p>
     <w:p>
@@ -6928,7 +6934,7 @@
         <w:pStyle w:val="ListNumber"/>
       </w:pPr>
       <w:r>
-        <w:t>OpenTelemetry is an integration/transport strategy, not the entire semantic model.</w:t>
+        <w:t>OpenTelemetry is a lossy inbound adapter after the raw-Python v1 slice, not the Tselora protocol and not an MVP dependency.</w:t>
       </w:r>
     </w:p>
     <w:p>
@@ -7165,7 +7171,7 @@
     </w:p>
     <w:p>
       <w:r>
-        <w:t>The highest-risk mistake is trying to implement the entire vision before proving the developer experience. The first public milestone should therefore be intentionally narrow: raw Python instrumentation → universal events → local collector → live graph/timeline → node inspector. If that workflow is compelling, add runtime control, replay/fork, framework adapters, and experience intelligence incrementally.</w:t>
+        <w:t>The highest-risk mistake is trying to implement the entire vision before proving the developer experience. The first public milestone is intentionally narrow: raw Python instrumentation → universal events → local JSONL collector → ProjectionEngine → live graph/timeline → node inspector → visualization replay. Runtime control, real fork, OTEL, inference correlation, and experience intelligence come after that workflow is compelling.</w:t>
       </w:r>
     </w:p>
     <w:p>

</xml_diff>